<commit_message>
Modification document Word (Étape 3)
</commit_message>
<xml_diff>
--- a/DocumentWord_TP2_Sebastian_Maxime.docx
+++ b/DocumentWord_TP2_Sebastian_Maxime.docx
@@ -34,6 +34,9 @@
         </w:p>
         <w:p>
           <w:r>
+            <w:rPr>
+              <w:noProof/>
+            </w:rPr>
             <mc:AlternateContent>
               <mc:Choice Requires="wps">
                 <w:drawing>
@@ -92,7 +95,7 @@
                                     <w:color w:val="2C7FCE" w:themeColor="text2" w:themeTint="99"/>
                                     <w:sz w:val="64"/>
                                     <w:szCs w:val="64"/>
-                                    <w:lang w:val="fr-CA"/>
+                                    <w:lang w:val="en-CA"/>
                                   </w:rPr>
                                   <w:alias w:val="Title"/>
                                   <w:tag w:val=""/>
@@ -116,7 +119,7 @@
                                         <w:color w:val="2C7FCE" w:themeColor="text2" w:themeTint="99"/>
                                         <w:sz w:val="68"/>
                                         <w:szCs w:val="68"/>
-                                        <w:lang w:val="fr-CA"/>
+                                        <w:lang w:val="en-CA"/>
                                       </w:rPr>
                                     </w:pPr>
                                     <w:r>
@@ -126,7 +129,7 @@
                                         <w:color w:val="2C7FCE" w:themeColor="text2" w:themeTint="99"/>
                                         <w:sz w:val="64"/>
                                         <w:szCs w:val="64"/>
-                                        <w:lang w:val="fr-CA"/>
+                                        <w:lang w:val="en-CA"/>
                                       </w:rPr>
                                       <w:t>TP2</w:t>
                                     </w:r>
@@ -137,7 +140,7 @@
                                         <w:color w:val="2C7FCE" w:themeColor="text2" w:themeTint="99"/>
                                         <w:sz w:val="64"/>
                                         <w:szCs w:val="64"/>
-                                        <w:lang w:val="fr-CA"/>
+                                        <w:lang w:val="en-CA"/>
                                       </w:rPr>
                                       <w:t xml:space="preserve"> – Document Word</w:t>
                                     </w:r>
@@ -152,7 +155,7 @@
                                     <w:color w:val="156082" w:themeColor="accent1"/>
                                     <w:sz w:val="36"/>
                                     <w:szCs w:val="36"/>
-                                    <w:lang w:val="fr-CA"/>
+                                    <w:lang w:val="en-CA"/>
                                   </w:rPr>
                                 </w:pPr>
                                 <w:sdt>
@@ -161,7 +164,7 @@
                                       <w:color w:val="156082" w:themeColor="accent1"/>
                                       <w:sz w:val="36"/>
                                       <w:szCs w:val="36"/>
-                                      <w:lang w:val="fr-CA"/>
+                                      <w:lang w:val="en-CA"/>
                                     </w:rPr>
                                     <w:alias w:val="Subtitle"/>
                                     <w:tag w:val=""/>
@@ -175,7 +178,7 @@
                                         <w:color w:val="156082" w:themeColor="accent1"/>
                                         <w:sz w:val="36"/>
                                         <w:szCs w:val="36"/>
-                                        <w:lang w:val="fr-CA"/>
+                                        <w:lang w:val="en-CA"/>
                                       </w:rPr>
                                       <w:t>Application Web</w:t>
                                     </w:r>
@@ -183,12 +186,18 @@
                                 </w:sdt>
                                 <w:r>
                                   <w:rPr>
-                                    <w:lang w:val="fr-CA"/>
+                                    <w:lang w:val="en-CA"/>
                                   </w:rPr>
                                   <w:t xml:space="preserve"> </w:t>
                                 </w:r>
                               </w:p>
-                              <w:p/>
+                              <w:p>
+                                <w:pPr>
+                                  <w:rPr>
+                                    <w:lang w:val="en-CA"/>
+                                  </w:rPr>
+                                </w:pPr>
+                              </w:p>
                             </w:txbxContent>
                           </wps:txbx>
                           <wps:bodyPr rot="0" spcFirstLastPara="0" vertOverflow="overflow" horzOverflow="overflow" vert="horz" wrap="square" lIns="91440" tIns="45720" rIns="91440" bIns="45720" numCol="1" spcCol="0" rtlCol="0" fromWordArt="0" anchor="t" anchorCtr="0" forceAA="0" compatLnSpc="1">
@@ -223,7 +232,7 @@
                               <w:color w:val="2C7FCE" w:themeColor="text2" w:themeTint="99"/>
                               <w:sz w:val="64"/>
                               <w:szCs w:val="64"/>
-                              <w:lang w:val="fr-CA"/>
+                              <w:lang w:val="en-CA"/>
                             </w:rPr>
                             <w:alias w:val="Title"/>
                             <w:tag w:val=""/>
@@ -247,7 +256,7 @@
                                   <w:color w:val="2C7FCE" w:themeColor="text2" w:themeTint="99"/>
                                   <w:sz w:val="68"/>
                                   <w:szCs w:val="68"/>
-                                  <w:lang w:val="fr-CA"/>
+                                  <w:lang w:val="en-CA"/>
                                 </w:rPr>
                               </w:pPr>
                               <w:r>
@@ -257,7 +266,7 @@
                                   <w:color w:val="2C7FCE" w:themeColor="text2" w:themeTint="99"/>
                                   <w:sz w:val="64"/>
                                   <w:szCs w:val="64"/>
-                                  <w:lang w:val="fr-CA"/>
+                                  <w:lang w:val="en-CA"/>
                                 </w:rPr>
                                 <w:t>TP2</w:t>
                               </w:r>
@@ -268,7 +277,7 @@
                                   <w:color w:val="2C7FCE" w:themeColor="text2" w:themeTint="99"/>
                                   <w:sz w:val="64"/>
                                   <w:szCs w:val="64"/>
-                                  <w:lang w:val="fr-CA"/>
+                                  <w:lang w:val="en-CA"/>
                                 </w:rPr>
                                 <w:t xml:space="preserve"> – Document Word</w:t>
                               </w:r>
@@ -283,7 +292,7 @@
                               <w:color w:val="156082" w:themeColor="accent1"/>
                               <w:sz w:val="36"/>
                               <w:szCs w:val="36"/>
-                              <w:lang w:val="fr-CA"/>
+                              <w:lang w:val="en-CA"/>
                             </w:rPr>
                           </w:pPr>
                           <w:sdt>
@@ -292,7 +301,7 @@
                                 <w:color w:val="156082" w:themeColor="accent1"/>
                                 <w:sz w:val="36"/>
                                 <w:szCs w:val="36"/>
-                                <w:lang w:val="fr-CA"/>
+                                <w:lang w:val="en-CA"/>
                               </w:rPr>
                               <w:alias w:val="Subtitle"/>
                               <w:tag w:val=""/>
@@ -306,7 +315,7 @@
                                   <w:color w:val="156082" w:themeColor="accent1"/>
                                   <w:sz w:val="36"/>
                                   <w:szCs w:val="36"/>
-                                  <w:lang w:val="fr-CA"/>
+                                  <w:lang w:val="en-CA"/>
                                 </w:rPr>
                                 <w:t>Application Web</w:t>
                               </w:r>
@@ -314,12 +323,18 @@
                           </w:sdt>
                           <w:r>
                             <w:rPr>
-                              <w:lang w:val="fr-CA"/>
+                              <w:lang w:val="en-CA"/>
                             </w:rPr>
                             <w:t xml:space="preserve"> </w:t>
                           </w:r>
                         </w:p>
-                        <w:p/>
+                        <w:p>
+                          <w:pPr>
+                            <w:rPr>
+                              <w:lang w:val="en-CA"/>
+                            </w:rPr>
+                          </w:pPr>
+                        </w:p>
                       </w:txbxContent>
                     </v:textbox>
                     <w10:wrap anchorx="page" anchory="margin"/>
@@ -330,6 +345,7 @@
           </w:r>
           <w:r>
             <w:rPr>
+              <w:noProof/>
               <w:color w:val="156082" w:themeColor="accent1"/>
               <w:sz w:val="36"/>
               <w:szCs w:val="36"/>
@@ -863,6 +879,9 @@
             </mc:AlternateContent>
           </w:r>
           <w:r>
+            <w:rPr>
+              <w:noProof/>
+            </w:rPr>
             <mc:AlternateContent>
               <mc:Choice Requires="wps">
                 <w:drawing>
@@ -1532,6 +1551,7 @@
       </w:pPr>
       <w:bookmarkStart w:id="0" w:name="_Toc227005622"/>
       <w:r>
+        <w:lastRenderedPageBreak/>
         <w:t>Description du projet</w:t>
       </w:r>
       <w:bookmarkEnd w:id="0"/>
@@ -1567,6 +1587,7 @@
       </w:pPr>
       <w:bookmarkStart w:id="1" w:name="_Toc227005623"/>
       <w:r>
+        <w:lastRenderedPageBreak/>
         <w:t>Modèle de données logique</w:t>
       </w:r>
       <w:bookmarkEnd w:id="1"/>
@@ -1630,6 +1651,7 @@
       </w:pPr>
       <w:bookmarkStart w:id="2" w:name="_Toc227005624"/>
       <w:r>
+        <w:lastRenderedPageBreak/>
         <w:t xml:space="preserve">Clé de lecture </w:t>
       </w:r>
       <w:r>
@@ -1649,17 +1671,12 @@
           <w:b/>
           <w:bCs/>
         </w:rPr>
-        <w:t>Fabricant — Console :</w:t>
+        <w:t>Relation Fabricant — Console</w:t>
       </w:r>
     </w:p>
     <w:p>
       <w:r>
-        <w:t>Un Fabricant peut produire plusieurs Consoles.</w:t>
-      </w:r>
-    </w:p>
-    <w:p>
-      <w:r>
-        <w:t>Une Console doit être produite par un seul Fabricant.</w:t>
+        <w:t>Un fabricant peut produire plusieurs modèles de consoles, mais chaque console est produite par un seul fabricant.</w:t>
       </w:r>
     </w:p>
     <w:p/>
@@ -1675,17 +1692,12 @@
           <w:b/>
           <w:bCs/>
         </w:rPr>
-        <w:t>Console — Jeu :</w:t>
+        <w:t>Relation Console — Jeu</w:t>
       </w:r>
     </w:p>
     <w:p>
       <w:r>
-        <w:t>Une Console peut accueillir plusieurs Jeux.</w:t>
-      </w:r>
-    </w:p>
-    <w:p>
-      <w:r>
-        <w:t>Un Jeu doit être destiné à une seule Console.</w:t>
+        <w:t>Une console peut accueillir une vaste bibliothèque de jeux, mais chaque titre de jeu est spécifiquement conçu pour une seule console.</w:t>
       </w:r>
     </w:p>
     <w:p/>
@@ -1701,17 +1713,12 @@
           <w:b/>
           <w:bCs/>
         </w:rPr>
-        <w:t>Genre — Jeu :</w:t>
+        <w:t>Relation Genre — Jeu</w:t>
       </w:r>
     </w:p>
     <w:p>
       <w:r>
-        <w:t>Un Genre peut classifier plusieurs Jeux.</w:t>
-      </w:r>
-    </w:p>
-    <w:p>
-      <w:r>
-        <w:t>Un Jeu doit appartenir à un seul Genre.</w:t>
+        <w:t>Un genre peut regrouper plusieurs jeux différents, mais chaque jeu est classé sous un seul genre principal.</w:t>
       </w:r>
     </w:p>
     <w:p/>
@@ -1727,17 +1734,12 @@
           <w:b/>
           <w:bCs/>
         </w:rPr>
-        <w:t>Jeu — Exemplaire :</w:t>
+        <w:t>Relation Jeu — Exemplaire</w:t>
       </w:r>
     </w:p>
     <w:p>
       <w:r>
-        <w:t>Un Jeu peut posséder plusieurs Exemplaires (doublons ou variantes).</w:t>
-      </w:r>
-    </w:p>
-    <w:p>
-      <w:r>
-        <w:t>Un Exemplaire doit représenter un seul Jeu.</w:t>
+        <w:t>Un titre de jeu peut posséder plusieurs exemplaires physiques dans la collection (doublons ou états différents), mais chaque exemplaire physique est rattaché à un seul titre de jeu.</w:t>
       </w:r>
       <w:r>
         <w:br w:type="page"/>
@@ -1749,6 +1751,7 @@
       </w:pPr>
       <w:bookmarkStart w:id="3" w:name="_Toc227005625"/>
       <w:r>
+        <w:lastRenderedPageBreak/>
         <w:t>Maquettes des écrans</w:t>
       </w:r>
       <w:bookmarkEnd w:id="3"/>
@@ -1769,6 +1772,7 @@
       </w:pPr>
       <w:bookmarkStart w:id="4" w:name="_Toc227005626"/>
       <w:r>
+        <w:lastRenderedPageBreak/>
         <w:t>Scripts de base de données</w:t>
       </w:r>
       <w:bookmarkEnd w:id="4"/>

</xml_diff>